<commit_message>
chore: update letterhead with provided ABN and address
</commit_message>
<xml_diff>
--- a/assets/divinefirm-letterhead.docx
+++ b/assets/divinefirm-letterhead.docx
@@ -93,7 +93,7 @@
       <w:rPr>
         <w:sz w:val="18"/>
       </w:rPr>
-      <w:t>DF Divine Firm • ABN: [insert ABN] • divinefirm30@gmail.com • www.divinefirm.online</w:t>
+      <w:t>DF Divine Firm • ABN: 90701540338 • divinefirm30@gmail.com • www.divinefirm.online</w:t>
     </w:r>
   </w:p>
 </w:ftr>
@@ -123,7 +123,7 @@
       <w:rPr>
         <w:sz w:val="18"/>
       </w:rPr>
-      <w:t>ABN: [insert ABN] | 123 Example Street, Suburb, State, Postcode</w:t>
+      <w:t>ABN: 90701540338 | 24 Borthwick Parade, Clyde North</w:t>
     </w:r>
   </w:p>
   <w:p>

</xml_diff>